<commit_message>
Working modal page on writing screen. Can now customize stroke width, whether to show the outline as well. Also fixed how the UI looked and operates when changing whether to show pinyin and defintion. Has a set state now
</commit_message>
<xml_diff>
--- a/backend/uploads/L1VocabCon.docx
+++ b/backend/uploads/L1VocabCon.docx
@@ -76,24 +76,16 @@
           <w:sz w:val="28"/>
           <w:szCs w:val="28"/>
         </w:rPr>
-        <w:t>请问，</w:t>
+        <w:t>你，</w:t>
       </w:r>
       <w:proofErr w:type="spellStart"/>
       <w:r>
         <w:rPr>
-          <w:rFonts w:ascii="Times New Roman" w:eastAsia="SimSun" w:hAnsi="Times New Roman" w:cs="Times New Roman" w:hint="eastAsia"/>
-          <w:sz w:val="28"/>
-          <w:szCs w:val="28"/>
-        </w:rPr>
-        <w:t>q</w:t>
-      </w:r>
-      <w:r>
-        <w:rPr>
-          <w:rFonts w:ascii="Times New Roman" w:eastAsia="SimSun" w:hAnsi="Times New Roman" w:cs="Times New Roman"/>
-          <w:sz w:val="28"/>
-          <w:szCs w:val="28"/>
-        </w:rPr>
-        <w:t>ǐngwèn</w:t>
+          <w:rFonts w:ascii="Times New Roman" w:eastAsia="SimSun" w:hAnsi="Times New Roman" w:cs="Times New Roman"/>
+          <w:sz w:val="28"/>
+          <w:szCs w:val="28"/>
+        </w:rPr>
+        <w:t>nǐ</w:t>
       </w:r>
       <w:proofErr w:type="spellEnd"/>
       <w:r>
@@ -102,7 +94,7 @@
           <w:sz w:val="28"/>
           <w:szCs w:val="28"/>
         </w:rPr>
-        <w:t>: may I ask</w:t>
+        <w:t>: you (singular pronoun)</w:t>
       </w:r>
     </w:p>
     <w:p>
@@ -188,24 +180,75 @@
           <w:sz w:val="28"/>
           <w:szCs w:val="28"/>
         </w:rPr>
-        <w:t>谢谢，</w:t>
+        <w:t>吗，</w:t>
+      </w:r>
+      <w:r>
+        <w:rPr>
+          <w:rFonts w:ascii="Times New Roman" w:eastAsia="SimSun" w:hAnsi="Times New Roman" w:cs="Times New Roman"/>
+          <w:sz w:val="28"/>
+          <w:szCs w:val="28"/>
+        </w:rPr>
+        <w:t>ma: a question particle</w:t>
+      </w:r>
+      <w:r>
+        <w:rPr>
+          <w:rFonts w:ascii="Times New Roman" w:eastAsia="SimSun" w:hAnsi="Times New Roman" w:cs="Times New Roman" w:hint="eastAsia"/>
+          <w:sz w:val="28"/>
+          <w:szCs w:val="28"/>
+        </w:rPr>
+        <w:t>，你忙吗</w:t>
+      </w:r>
+    </w:p>
+    <w:p>
+      <w:pPr>
+        <w:rPr>
+          <w:rFonts w:ascii="Times New Roman" w:eastAsia="SimSun" w:hAnsi="Times New Roman" w:cs="Times New Roman"/>
+          <w:sz w:val="28"/>
+          <w:szCs w:val="28"/>
+        </w:rPr>
+      </w:pPr>
+    </w:p>
+    <w:p>
+      <w:pPr>
+        <w:rPr>
+          <w:rFonts w:ascii="Times New Roman" w:eastAsia="SimSun" w:hAnsi="Times New Roman" w:cs="Times New Roman"/>
+          <w:sz w:val="28"/>
+          <w:szCs w:val="28"/>
+        </w:rPr>
+      </w:pPr>
+      <w:r>
+        <w:rPr>
+          <w:rFonts w:ascii="Times New Roman" w:eastAsia="SimSun" w:hAnsi="Times New Roman" w:cs="Times New Roman"/>
+          <w:sz w:val="28"/>
+          <w:szCs w:val="28"/>
+        </w:rPr>
+        <w:t>Supplementary</w:t>
+      </w:r>
+    </w:p>
+    <w:p>
+      <w:pPr>
+        <w:rPr>
+          <w:rFonts w:ascii="Times New Roman" w:eastAsia="SimSun" w:hAnsi="Times New Roman" w:cs="Times New Roman"/>
+          <w:sz w:val="28"/>
+          <w:szCs w:val="28"/>
+        </w:rPr>
+      </w:pPr>
+      <w:r>
+        <w:rPr>
+          <w:rFonts w:ascii="Times New Roman" w:eastAsia="SimSun" w:hAnsi="Times New Roman" w:cs="Times New Roman" w:hint="eastAsia"/>
+          <w:sz w:val="28"/>
+          <w:szCs w:val="28"/>
+        </w:rPr>
+        <w:t>困，</w:t>
       </w:r>
       <w:proofErr w:type="spellStart"/>
       <w:r>
         <w:rPr>
-          <w:rFonts w:ascii="Times New Roman" w:eastAsia="SimSun" w:hAnsi="Times New Roman" w:cs="Times New Roman" w:hint="eastAsia"/>
-          <w:sz w:val="28"/>
-          <w:szCs w:val="28"/>
-        </w:rPr>
-        <w:t>x</w:t>
-      </w:r>
-      <w:r>
-        <w:rPr>
-          <w:rFonts w:ascii="Times New Roman" w:eastAsia="SimSun" w:hAnsi="Times New Roman" w:cs="Times New Roman"/>
-          <w:sz w:val="28"/>
-          <w:szCs w:val="28"/>
-        </w:rPr>
-        <w:t>ièxie</w:t>
+          <w:rFonts w:ascii="Times New Roman" w:eastAsia="SimSun" w:hAnsi="Times New Roman" w:cs="Times New Roman"/>
+          <w:sz w:val="28"/>
+          <w:szCs w:val="28"/>
+        </w:rPr>
+        <w:t>kùn</w:t>
       </w:r>
       <w:proofErr w:type="spellEnd"/>
       <w:r>
@@ -214,95 +257,16 @@
           <w:sz w:val="28"/>
           <w:szCs w:val="28"/>
         </w:rPr>
-        <w:t>: to thank</w:t>
-      </w:r>
-      <w:r>
-        <w:rPr>
-          <w:rFonts w:ascii="Times New Roman" w:eastAsia="SimSun" w:hAnsi="Times New Roman" w:cs="Times New Roman" w:hint="eastAsia"/>
-          <w:sz w:val="28"/>
-          <w:szCs w:val="28"/>
-        </w:rPr>
-        <w:t>，谢谢你</w:t>
-      </w:r>
-    </w:p>
-    <w:p>
-      <w:pPr>
-        <w:rPr>
-          <w:rFonts w:ascii="Times New Roman" w:eastAsia="SimSun" w:hAnsi="Times New Roman" w:cs="Times New Roman"/>
-          <w:sz w:val="28"/>
-          <w:szCs w:val="28"/>
-        </w:rPr>
-      </w:pPr>
-    </w:p>
-    <w:p>
-      <w:pPr>
-        <w:rPr>
-          <w:rFonts w:ascii="Times New Roman" w:eastAsia="SimSun" w:hAnsi="Times New Roman" w:cs="Times New Roman"/>
-          <w:sz w:val="28"/>
-          <w:szCs w:val="28"/>
-        </w:rPr>
-      </w:pPr>
-      <w:r>
-        <w:rPr>
-          <w:rFonts w:ascii="Times New Roman" w:eastAsia="SimSun" w:hAnsi="Times New Roman" w:cs="Times New Roman"/>
-          <w:sz w:val="28"/>
-          <w:szCs w:val="28"/>
-        </w:rPr>
-        <w:t>Supplementary</w:t>
-      </w:r>
-    </w:p>
-    <w:p>
-      <w:pPr>
-        <w:rPr>
-          <w:rFonts w:ascii="Times New Roman" w:eastAsia="SimSun" w:hAnsi="Times New Roman" w:cs="Times New Roman"/>
-          <w:sz w:val="28"/>
-          <w:szCs w:val="28"/>
-        </w:rPr>
-      </w:pPr>
-      <w:r>
-        <w:rPr>
-          <w:rFonts w:ascii="Times New Roman" w:eastAsia="SimSun" w:hAnsi="Times New Roman" w:cs="Times New Roman" w:hint="eastAsia"/>
-          <w:sz w:val="28"/>
-          <w:szCs w:val="28"/>
-        </w:rPr>
-        <w:t>马马虎虎，</w:t>
-      </w:r>
-      <w:proofErr w:type="spellStart"/>
-      <w:r>
-        <w:rPr>
-          <w:rFonts w:ascii="Times New Roman" w:eastAsia="SimSun" w:hAnsi="Times New Roman" w:cs="Times New Roman" w:hint="eastAsia"/>
-          <w:sz w:val="28"/>
-          <w:szCs w:val="28"/>
-        </w:rPr>
-        <w:t>m</w:t>
-      </w:r>
-      <w:r>
-        <w:rPr>
-          <w:rFonts w:ascii="Times New Roman" w:eastAsia="SimSun" w:hAnsi="Times New Roman" w:cs="Times New Roman"/>
-          <w:sz w:val="28"/>
-          <w:szCs w:val="28"/>
-        </w:rPr>
-        <w:t>ǎmǎhūhū</w:t>
-      </w:r>
-      <w:proofErr w:type="spellEnd"/>
-      <w:r>
-        <w:rPr>
-          <w:rFonts w:ascii="Times New Roman" w:eastAsia="SimSun" w:hAnsi="Times New Roman" w:cs="Times New Roman"/>
-          <w:sz w:val="28"/>
-          <w:szCs w:val="28"/>
-        </w:rPr>
-        <w:t xml:space="preserve">: so </w:t>
-      </w:r>
-      <w:proofErr w:type="spellStart"/>
-      <w:r>
-        <w:rPr>
-          <w:rFonts w:ascii="Times New Roman" w:eastAsia="SimSun" w:hAnsi="Times New Roman" w:cs="Times New Roman"/>
-          <w:sz w:val="28"/>
-          <w:szCs w:val="28"/>
-        </w:rPr>
-        <w:t>so</w:t>
-      </w:r>
-      <w:proofErr w:type="spellEnd"/>
+        <w:t>: sleepy</w:t>
+      </w:r>
+      <w:r>
+        <w:rPr>
+          <w:rFonts w:ascii="Times New Roman" w:eastAsia="SimSun" w:hAnsi="Times New Roman" w:cs="Times New Roman" w:hint="eastAsia"/>
+          <w:sz w:val="28"/>
+          <w:szCs w:val="28"/>
+        </w:rPr>
+        <w:t>，很困</w:t>
+      </w:r>
     </w:p>
     <w:p>
       <w:pPr>
@@ -877,7 +841,6 @@
   <w:style w:type="character" w:default="1" w:styleId="DefaultParagraphFont">
     <w:name w:val="Default Paragraph Font"/>
     <w:uiPriority w:val="1"/>
-    <w:semiHidden/>
     <w:unhideWhenUsed/>
   </w:style>
   <w:style w:type="table" w:default="1" w:styleId="TableNormal">

</xml_diff>